<commit_message>
Deutschsprachige Überarbeitung mit dem klartext-Skill
Alle Texte durch die 36 Muster des klartext-Skills gezogen, davon sieben
deutschspezifische. Der englische Humanizer erkennt diese nicht.

- Kontraste als Kontraste formuliert: 'aber' von 2 auf 12 Vorkommen
- Absatzlängen gestreut statt gleichförmig
- Register gelockert (ruhig, gar nicht, klingt banal)
- Quick-Check-Signale alle auf null

Unangetastet: System-Prompts, Guardrails und Kopiervorlagen (funktionale
Texte, die in fobizz und Gemini eingesetzt werden) sowie das wörtliche
Kernlehrplan-Zitat.

Co-Authored-By: Claude Opus 5 <noreply@anthropic.com>
</commit_message>
<xml_diff>
--- a/3_Arbeitsauftrag_Vormittag.docx
+++ b/3_Arbeitsauftrag_Vormittag.docx
@@ -66,7 +66,7 @@
           <w:b w:val="0"/>
           <w:i w:val="0"/>
         </w:rPr>
-        <w:t>In eurer Kleingruppe baut ihr ein Unterrichtselement, in dem die KI eure Schülerinnen und Schüler nicht bedient, sondern fordert. Wir nennen das Ping-Pong: Die Klasse schreibt etwas, die KI spielt ein kriterienbasiertes Feedback zurück, die Lernenden überarbeiten. Kein fertiges Ergebnis auf Knopfdruck. Die KI fragt nach, denken müssen die anderen.</w:t>
+        <w:t>Ihr baut ein Unterrichtselement, in dem die KI eure Klasse nicht bedient, sondern fordert. Ping-Pong nennen wir das: Die Lernenden schreiben etwas, die KI spielt kriterienbasiertes Feedback zurück, sie überarbeiten. Klingt simpel. Die Kunst steckt darin, dass die KI nachfragt, statt die Lösung zu verschenken.</w:t>
       </w:r>
     </w:p>
     <w:tbl>
@@ -105,7 +105,7 @@
               <w:rPr>
                 <w:b w:val="0"/>
               </w:rPr>
-              <w:t>Der fobizz-Chatbot versteht nur Text. Keine Fotos, keine Handschrift-Scans, keine Bilder; so schreibt es der Datenschutz vor. Für euch heißt das: Was die Lernenden abgeben, muss von Anfang an getippt oder diktiert sein. Denkt schon bei der Themenwahl daran. Das Themen-Rezept hilft dabei.</w:t>
+              <w:t>Der fobizz-Chatbot versteht nur Text. Keine Fotos, keine Scans, keine Bilder, so will es der Datenschutz. Was die Lernenden abgeben, muss also getippt oder diktiert sein. Das klingt nach einer kleinen Einschränkung, entscheidet aber schon über die Themenwahl.</w:t>
             </w:r>
           </w:p>
         </w:tc>
@@ -169,7 +169,7 @@
           <w:b w:val="0"/>
           <w:i w:val="0"/>
         </w:rPr>
-        <w:t>Sucht euch aus eurem Fach eine Stunde, in der die Lernenden etwas Sprachliches produzieren: eine Begründung, eine Argumentation, eine Deutung, einen in Worten erklärten Rechenweg. Fällt euch nichts ein, greift zum Themen-Rezept. Dort stehen vier ausgearbeitete Beispiele und ein Notfall-Thema, das in fast jedem Fach zieht.</w:t>
+        <w:t>Sucht euch aus eurem Fach eine Stunde, in der die Lernenden etwas Sprachliches produzieren: eine Begründung, eine Deutung, einen in Worten erklärten Rechenweg. Fällt euch spontan nichts ein, ist das normal. Im Themen-Rezept stehen vier ausgearbeitete Beispiele und ein Notfall-Thema, das in fast jedem Fach zieht.</w:t>
       </w:r>
     </w:p>
     <w:p>
@@ -201,7 +201,7 @@
         <w:pStyle w:val="ListNumber"/>
       </w:pPr>
       <w:r>
-        <w:t>Den System-Prompt schreiben, also die Anweisung, an die sich der Bot hält. Nehmt dafür den System-Prompt-Baukasten. Wichtig sind vor allem die Guardrails: die Zeilen, die den Bot davon abhalten, einfach die Lösung zu verraten.</w:t>
+        <w:t>Den System-Prompt schreiben, also die Anweisung, an die sich der Bot hält. Nehmt dafür den System-Prompt-Baukasten. Der wichtigste Teil sind die Guardrails. Ohne sie rückt der Bot die Lösung heraus, sobald jemand freundlich genug fragt.</w:t>
       </w:r>
     </w:p>
     <w:p>
@@ -276,7 +276,7 @@
               <w:rPr>
                 <w:b w:val="0"/>
               </w:rPr>
-              <w:t>Der Umweg „abfotografieren und hochladen“ fällt weg. Der Bot kann Bilder nicht lesen, und persönliche Fotos haben in dieser Umgebung ohnehin nichts verloren. Baut euer Szenario also so, dass niemand etwas fotografieren muss.</w:t>
+              <w:t>Der Umweg über das Foto fällt weg. Der Bot kann Bilder nicht lesen, und persönliche Aufnahmen haben in dieser Umgebung ohnehin nichts verloren. Baut euer Szenario also so, dass niemand zum Handy greifen muss.</w:t>
             </w:r>
           </w:p>
         </w:tc>

</xml_diff>

<commit_message>
Zweiter Sprachdurchgang mit dem vermenschlichen-Skill
Der Skill von LOGIN-TB baut auf der deutschen Wikipedia-Seite 'Anzeichen
für KI-generierte Inhalte' auf und zielt auf nüchterne, zurückhaltende
Sprache. Für Unterrichtsmaterial passt das besser als der auf
Blog-Persönlichkeit ausgerichtete klartext-Skill.

Drei Muster gefunden, die klartext nicht sieht:
- 'X statt Y' als Dauerfigur: 22 Vorkommen, jetzt 0
- Inline-Header-Listen ('PDFs: Schulbuchseiten'): 12, jetzt 0
- Negativer Parallelismus: 11, jetzt 7

Die verbliebenen sieben bleiben bewusst stehen: fünf tragen echte
Kontraste, zwei stecken in Guardrail-Kopiervorlagen. Der Skill warnt
selbst vor Überkorrektur.

Sauber ohne Befund: Kopula-Vermeidung, steife Synonyme,
Partizip-Anhängsel, Fazit-Baustein, Werbesprache, vage Autoritäten.

Co-Authored-By: Claude Opus 5 <noreply@anthropic.com>
</commit_message>
<xml_diff>
--- a/3_Arbeitsauftrag_Vormittag.docx
+++ b/3_Arbeitsauftrag_Vormittag.docx
@@ -38,7 +38,7 @@
           <w:color w:val="595959"/>
           <w:sz w:val="23"/>
         </w:rPr>
-        <w:t>Ein Lernszenario für den fobizz-Klassenraum bauen: textbasiert, datenschutzkonform, und so, dass die Köpfe arbeiten statt der KI</w:t>
+        <w:t>Ein Lernszenario für den fobizz-Klassenraum bauen: textbasiert, datenschutzkonform, und so, dass die Lernenden denken müssen</w:t>
       </w:r>
     </w:p>
     <w:p>
@@ -66,7 +66,7 @@
           <w:b w:val="0"/>
           <w:i w:val="0"/>
         </w:rPr>
-        <w:t>Ihr baut ein Unterrichtselement, in dem die KI eure Klasse nicht bedient, sondern fordert. Ping-Pong nennen wir das: Die Lernenden schreiben etwas, die KI spielt kriterienbasiertes Feedback zurück, sie überarbeiten. Klingt simpel. Die Kunst steckt darin, dass die KI nachfragt, statt die Lösung zu verschenken.</w:t>
+        <w:t>Ihr baut ein Unterrichtselement, in dem die KI eure Klasse nicht bedient, sondern fordert. Ping-Pong nennen wir das: Die Lernenden schreiben etwas, die KI spielt kriterienbasiertes Feedback zurück, sie überarbeiten. Klingt simpel. Die Kunst liegt darin, dass die KI nachfragt und die Lösung für sich behält.</w:t>
       </w:r>
     </w:p>
     <w:tbl>
@@ -324,7 +324,7 @@
         <w:pStyle w:val="ListNumber"/>
       </w:pPr>
       <w:r>
-        <w:t>Sie prüfen die Hinweise, statt sie blind zu übernehmen.</w:t>
+        <w:t>Sie prüfen die Hinweise kritisch und übernehmen sie nicht blind.</w:t>
       </w:r>
     </w:p>
     <w:p>

</xml_diff>